<commit_message>
Update README.docx and expense_tracker.py
</commit_message>
<xml_diff>
--- a/README.docx
+++ b/README.docx
@@ -324,6 +324,7 @@
             </w:tcMar>
           </w:tcPr>
           <w:p>
+            <w:bookmarkStart w:id="0" w:name="_GoBack" w:colFirst="3" w:colLast="3"/>
             <w:r>
               <w:rPr>
                 <w:rFonts w:ascii="Arial" w:hAnsi="Arial" w:eastAsia="Arial" w:cs="Arial"/>
@@ -528,6 +529,12 @@
             </w:tcMar>
           </w:tcPr>
           <w:p>
+            <w:pPr>
+              <w:rPr>
+                <w:sz w:val="18"/>
+                <w:szCs w:val="18"/>
+              </w:rPr>
+            </w:pPr>
             <w:r>
               <w:rPr>
                 <w:rFonts w:ascii="Arial" w:hAnsi="Arial" w:eastAsia="Arial" w:cs="Arial"/>
@@ -559,6 +566,12 @@
             </w:tcMar>
           </w:tcPr>
           <w:p>
+            <w:pPr>
+              <w:rPr>
+                <w:sz w:val="18"/>
+                <w:szCs w:val="18"/>
+              </w:rPr>
+            </w:pPr>
             <w:r>
               <w:rPr>
                 <w:rFonts w:ascii="Arial" w:hAnsi="Arial" w:eastAsia="Arial" w:cs="Arial"/>
@@ -593,6 +606,8 @@
             <w:pPr>
               <w:rPr>
                 <w:rFonts w:hint="default"/>
+                <w:sz w:val="18"/>
+                <w:szCs w:val="18"/>
                 <w:lang w:val="en-US"/>
               </w:rPr>
             </w:pPr>
@@ -639,6 +654,12 @@
             </w:tcMar>
           </w:tcPr>
           <w:p>
+            <w:pPr>
+              <w:rPr>
+                <w:sz w:val="18"/>
+                <w:szCs w:val="18"/>
+              </w:rPr>
+            </w:pPr>
             <w:r>
               <w:rPr>
                 <w:rFonts w:ascii="Arial" w:hAnsi="Arial" w:eastAsia="Arial" w:cs="Arial"/>
@@ -670,6 +691,12 @@
             </w:tcMar>
           </w:tcPr>
           <w:p>
+            <w:pPr>
+              <w:rPr>
+                <w:sz w:val="18"/>
+                <w:szCs w:val="18"/>
+              </w:rPr>
+            </w:pPr>
             <w:r>
               <w:rPr>
                 <w:rFonts w:ascii="Arial" w:hAnsi="Arial" w:eastAsia="Arial" w:cs="Arial"/>
@@ -701,6 +728,12 @@
             </w:tcMar>
           </w:tcPr>
           <w:p>
+            <w:pPr>
+              <w:rPr>
+                <w:sz w:val="18"/>
+                <w:szCs w:val="18"/>
+              </w:rPr>
+            </w:pPr>
             <w:r>
               <w:rPr>
                 <w:rFonts w:ascii="Arial" w:hAnsi="Arial" w:eastAsia="Arial" w:cs="Arial"/>
@@ -750,6 +783,12 @@
             </w:tcMar>
           </w:tcPr>
           <w:p>
+            <w:pPr>
+              <w:rPr>
+                <w:sz w:val="18"/>
+                <w:szCs w:val="18"/>
+              </w:rPr>
+            </w:pPr>
             <w:r>
               <w:rPr>
                 <w:rFonts w:ascii="Arial" w:hAnsi="Arial" w:eastAsia="Arial" w:cs="Arial"/>
@@ -781,6 +820,12 @@
             </w:tcMar>
           </w:tcPr>
           <w:p>
+            <w:pPr>
+              <w:rPr>
+                <w:sz w:val="18"/>
+                <w:szCs w:val="18"/>
+              </w:rPr>
+            </w:pPr>
             <w:r>
               <w:rPr>
                 <w:rFonts w:ascii="Arial" w:hAnsi="Arial" w:eastAsia="Arial" w:cs="Arial"/>
@@ -815,12 +860,16 @@
             <w:pPr>
               <w:rPr>
                 <w:rFonts w:hint="default"/>
+                <w:sz w:val="18"/>
+                <w:szCs w:val="18"/>
                 <w:lang w:val="en-US"/>
               </w:rPr>
             </w:pPr>
             <w:r>
               <w:rPr>
                 <w:rFonts w:hint="default"/>
+                <w:sz w:val="18"/>
+                <w:szCs w:val="18"/>
                 <w:lang w:val="en-US"/>
               </w:rPr>
               <w:t>Sanjay</w:t>
@@ -845,6 +894,12 @@
             </w:tcMar>
           </w:tcPr>
           <w:p>
+            <w:pPr>
+              <w:rPr>
+                <w:sz w:val="18"/>
+                <w:szCs w:val="18"/>
+              </w:rPr>
+            </w:pPr>
             <w:r>
               <w:rPr>
                 <w:rFonts w:ascii="Arial" w:hAnsi="Arial" w:eastAsia="Arial" w:cs="Arial"/>
@@ -879,12 +934,16 @@
             <w:pPr>
               <w:rPr>
                 <w:rFonts w:hint="default"/>
+                <w:sz w:val="18"/>
+                <w:szCs w:val="18"/>
                 <w:lang w:val="en-US"/>
               </w:rPr>
             </w:pPr>
             <w:r>
               <w:rPr>
                 <w:rFonts w:hint="default"/>
+                <w:sz w:val="18"/>
+                <w:szCs w:val="18"/>
                 <w:lang w:val="en-US"/>
               </w:rPr>
               <w:t>Sanjay,Niraj,Manish</w:t>
@@ -909,6 +968,12 @@
             </w:tcMar>
           </w:tcPr>
           <w:p>
+            <w:pPr>
+              <w:rPr>
+                <w:sz w:val="18"/>
+                <w:szCs w:val="18"/>
+              </w:rPr>
+            </w:pPr>
             <w:r>
               <w:rPr>
                 <w:rFonts w:ascii="Arial" w:hAnsi="Arial" w:eastAsia="Arial" w:cs="Arial"/>
@@ -958,6 +1023,12 @@
             </w:tcMar>
           </w:tcPr>
           <w:p>
+            <w:pPr>
+              <w:rPr>
+                <w:sz w:val="18"/>
+                <w:szCs w:val="18"/>
+              </w:rPr>
+            </w:pPr>
             <w:r>
               <w:rPr>
                 <w:rFonts w:ascii="Arial" w:hAnsi="Arial" w:eastAsia="Arial" w:cs="Arial"/>
@@ -989,6 +1060,12 @@
             </w:tcMar>
           </w:tcPr>
           <w:p>
+            <w:pPr>
+              <w:rPr>
+                <w:sz w:val="18"/>
+                <w:szCs w:val="18"/>
+              </w:rPr>
+            </w:pPr>
             <w:r>
               <w:rPr>
                 <w:rFonts w:ascii="Arial" w:hAnsi="Arial" w:eastAsia="Arial" w:cs="Arial"/>
@@ -1023,12 +1100,16 @@
             <w:pPr>
               <w:rPr>
                 <w:rFonts w:hint="default"/>
+                <w:sz w:val="18"/>
+                <w:szCs w:val="18"/>
                 <w:lang w:val="en-US"/>
               </w:rPr>
             </w:pPr>
             <w:r>
               <w:rPr>
                 <w:rFonts w:hint="default"/>
+                <w:sz w:val="18"/>
+                <w:szCs w:val="18"/>
                 <w:lang w:val="en-US"/>
               </w:rPr>
               <w:t>Niraj</w:t>
@@ -1053,6 +1134,12 @@
             </w:tcMar>
           </w:tcPr>
           <w:p>
+            <w:pPr>
+              <w:rPr>
+                <w:sz w:val="18"/>
+                <w:szCs w:val="18"/>
+              </w:rPr>
+            </w:pPr>
             <w:r>
               <w:rPr>
                 <w:rFonts w:ascii="Arial" w:hAnsi="Arial" w:eastAsia="Arial" w:cs="Arial"/>
@@ -1087,6 +1174,8 @@
             <w:pPr>
               <w:rPr>
                 <w:rFonts w:hint="default"/>
+                <w:sz w:val="18"/>
+                <w:szCs w:val="18"/>
                 <w:lang w:val="en-US"/>
               </w:rPr>
             </w:pPr>
@@ -1122,6 +1211,12 @@
             </w:tcMar>
           </w:tcPr>
           <w:p>
+            <w:pPr>
+              <w:rPr>
+                <w:sz w:val="18"/>
+                <w:szCs w:val="18"/>
+              </w:rPr>
+            </w:pPr>
             <w:r>
               <w:rPr>
                 <w:rFonts w:ascii="Arial" w:hAnsi="Arial" w:eastAsia="Arial" w:cs="Arial"/>
@@ -1171,6 +1266,12 @@
             </w:tcMar>
           </w:tcPr>
           <w:p>
+            <w:pPr>
+              <w:rPr>
+                <w:sz w:val="18"/>
+                <w:szCs w:val="18"/>
+              </w:rPr>
+            </w:pPr>
             <w:r>
               <w:rPr>
                 <w:rFonts w:ascii="Arial" w:hAnsi="Arial" w:eastAsia="Arial" w:cs="Arial"/>
@@ -1202,6 +1303,12 @@
             </w:tcMar>
           </w:tcPr>
           <w:p>
+            <w:pPr>
+              <w:rPr>
+                <w:sz w:val="18"/>
+                <w:szCs w:val="18"/>
+              </w:rPr>
+            </w:pPr>
             <w:r>
               <w:rPr>
                 <w:rFonts w:ascii="Arial" w:hAnsi="Arial" w:eastAsia="Arial" w:cs="Arial"/>
@@ -1236,12 +1343,16 @@
             <w:pPr>
               <w:rPr>
                 <w:rFonts w:hint="default"/>
+                <w:sz w:val="18"/>
+                <w:szCs w:val="18"/>
                 <w:lang w:val="en-US"/>
               </w:rPr>
             </w:pPr>
             <w:r>
               <w:rPr>
                 <w:rFonts w:hint="default"/>
+                <w:sz w:val="18"/>
+                <w:szCs w:val="18"/>
                 <w:lang w:val="en-US"/>
               </w:rPr>
               <w:t>Manish</w:t>
@@ -1266,6 +1377,12 @@
             </w:tcMar>
           </w:tcPr>
           <w:p>
+            <w:pPr>
+              <w:rPr>
+                <w:sz w:val="18"/>
+                <w:szCs w:val="18"/>
+              </w:rPr>
+            </w:pPr>
             <w:r>
               <w:rPr>
                 <w:rFonts w:ascii="Arial" w:hAnsi="Arial" w:eastAsia="Arial" w:cs="Arial"/>
@@ -1300,6 +1417,8 @@
             <w:pPr>
               <w:rPr>
                 <w:rFonts w:hint="default"/>
+                <w:sz w:val="18"/>
+                <w:szCs w:val="18"/>
                 <w:lang w:val="en-US"/>
               </w:rPr>
             </w:pPr>
@@ -1358,6 +1477,12 @@
             </w:tcMar>
           </w:tcPr>
           <w:p>
+            <w:pPr>
+              <w:rPr>
+                <w:sz w:val="18"/>
+                <w:szCs w:val="18"/>
+              </w:rPr>
+            </w:pPr>
             <w:r>
               <w:rPr>
                 <w:rFonts w:ascii="Arial" w:hAnsi="Arial" w:eastAsia="Arial" w:cs="Arial"/>
@@ -1407,6 +1532,12 @@
             </w:tcMar>
           </w:tcPr>
           <w:p>
+            <w:pPr>
+              <w:rPr>
+                <w:sz w:val="18"/>
+                <w:szCs w:val="18"/>
+              </w:rPr>
+            </w:pPr>
             <w:r>
               <w:rPr>
                 <w:rFonts w:ascii="Arial" w:hAnsi="Arial" w:eastAsia="Arial" w:cs="Arial"/>
@@ -1438,6 +1569,12 @@
             </w:tcMar>
           </w:tcPr>
           <w:p>
+            <w:pPr>
+              <w:rPr>
+                <w:sz w:val="18"/>
+                <w:szCs w:val="18"/>
+              </w:rPr>
+            </w:pPr>
             <w:r>
               <w:rPr>
                 <w:rFonts w:ascii="Arial" w:hAnsi="Arial" w:eastAsia="Arial" w:cs="Arial"/>
@@ -1472,12 +1609,16 @@
             <w:pPr>
               <w:rPr>
                 <w:rFonts w:hint="default"/>
+                <w:sz w:val="18"/>
+                <w:szCs w:val="18"/>
                 <w:lang w:val="en-US"/>
               </w:rPr>
             </w:pPr>
             <w:r>
               <w:rPr>
                 <w:rFonts w:hint="default"/>
+                <w:sz w:val="18"/>
+                <w:szCs w:val="18"/>
                 <w:lang w:val="en-US"/>
               </w:rPr>
               <w:t>Gaurav</w:t>
@@ -1502,6 +1643,12 @@
             </w:tcMar>
           </w:tcPr>
           <w:p>
+            <w:pPr>
+              <w:rPr>
+                <w:sz w:val="18"/>
+                <w:szCs w:val="18"/>
+              </w:rPr>
+            </w:pPr>
             <w:r>
               <w:rPr>
                 <w:rFonts w:ascii="Arial" w:hAnsi="Arial" w:eastAsia="Arial" w:cs="Arial"/>
@@ -1536,6 +1683,8 @@
             <w:pPr>
               <w:rPr>
                 <w:rFonts w:hint="default"/>
+                <w:sz w:val="18"/>
+                <w:szCs w:val="18"/>
                 <w:lang w:val="en-US"/>
               </w:rPr>
             </w:pPr>
@@ -1640,6 +1789,12 @@
             </w:tcMar>
           </w:tcPr>
           <w:p>
+            <w:pPr>
+              <w:rPr>
+                <w:sz w:val="18"/>
+                <w:szCs w:val="18"/>
+              </w:rPr>
+            </w:pPr>
             <w:r>
               <w:rPr>
                 <w:rFonts w:ascii="Arial" w:hAnsi="Arial" w:eastAsia="Arial" w:cs="Arial"/>
@@ -1689,6 +1844,12 @@
             </w:tcMar>
           </w:tcPr>
           <w:p>
+            <w:pPr>
+              <w:rPr>
+                <w:sz w:val="18"/>
+                <w:szCs w:val="18"/>
+              </w:rPr>
+            </w:pPr>
             <w:r>
               <w:rPr>
                 <w:rFonts w:ascii="Arial" w:hAnsi="Arial" w:eastAsia="Arial" w:cs="Arial"/>
@@ -1720,6 +1881,12 @@
             </w:tcMar>
           </w:tcPr>
           <w:p>
+            <w:pPr>
+              <w:rPr>
+                <w:sz w:val="18"/>
+                <w:szCs w:val="18"/>
+              </w:rPr>
+            </w:pPr>
             <w:r>
               <w:rPr>
                 <w:rFonts w:ascii="Arial" w:hAnsi="Arial" w:eastAsia="Arial" w:cs="Arial"/>
@@ -1754,12 +1921,16 @@
             <w:pPr>
               <w:rPr>
                 <w:rFonts w:hint="default"/>
+                <w:sz w:val="18"/>
+                <w:szCs w:val="18"/>
                 <w:lang w:val="en-US"/>
               </w:rPr>
             </w:pPr>
             <w:r>
               <w:rPr>
                 <w:rFonts w:hint="default"/>
+                <w:sz w:val="18"/>
+                <w:szCs w:val="18"/>
                 <w:lang w:val="en-US"/>
               </w:rPr>
               <w:t>Anmol</w:t>
@@ -1784,6 +1955,12 @@
             </w:tcMar>
           </w:tcPr>
           <w:p>
+            <w:pPr>
+              <w:rPr>
+                <w:sz w:val="18"/>
+                <w:szCs w:val="18"/>
+              </w:rPr>
+            </w:pPr>
             <w:r>
               <w:rPr>
                 <w:rFonts w:ascii="Arial" w:hAnsi="Arial" w:eastAsia="Arial" w:cs="Arial"/>
@@ -1818,6 +1995,8 @@
             <w:pPr>
               <w:rPr>
                 <w:rFonts w:hint="default"/>
+                <w:sz w:val="18"/>
+                <w:szCs w:val="18"/>
                 <w:lang w:val="en-US"/>
               </w:rPr>
             </w:pPr>
@@ -1853,6 +2032,12 @@
             </w:tcMar>
           </w:tcPr>
           <w:p>
+            <w:pPr>
+              <w:rPr>
+                <w:sz w:val="18"/>
+                <w:szCs w:val="18"/>
+              </w:rPr>
+            </w:pPr>
             <w:r>
               <w:rPr>
                 <w:rFonts w:ascii="Arial" w:hAnsi="Arial" w:eastAsia="Arial" w:cs="Arial"/>
@@ -1902,6 +2087,12 @@
             </w:tcMar>
           </w:tcPr>
           <w:p>
+            <w:pPr>
+              <w:rPr>
+                <w:sz w:val="18"/>
+                <w:szCs w:val="18"/>
+              </w:rPr>
+            </w:pPr>
             <w:r>
               <w:rPr>
                 <w:rFonts w:ascii="Arial" w:hAnsi="Arial" w:eastAsia="Arial" w:cs="Arial"/>
@@ -1933,6 +2124,12 @@
             </w:tcMar>
           </w:tcPr>
           <w:p>
+            <w:pPr>
+              <w:rPr>
+                <w:sz w:val="18"/>
+                <w:szCs w:val="18"/>
+              </w:rPr>
+            </w:pPr>
             <w:r>
               <w:rPr>
                 <w:rFonts w:ascii="Arial" w:hAnsi="Arial" w:eastAsia="Arial" w:cs="Arial"/>
@@ -1967,12 +2164,16 @@
             <w:pPr>
               <w:rPr>
                 <w:rFonts w:hint="default"/>
+                <w:sz w:val="18"/>
+                <w:szCs w:val="18"/>
                 <w:lang w:val="en-US"/>
               </w:rPr>
             </w:pPr>
             <w:r>
               <w:rPr>
                 <w:rFonts w:hint="default"/>
+                <w:sz w:val="18"/>
+                <w:szCs w:val="18"/>
                 <w:lang w:val="en-US"/>
               </w:rPr>
               <w:t>Sanjay</w:t>
@@ -1997,6 +2198,12 @@
             </w:tcMar>
           </w:tcPr>
           <w:p>
+            <w:pPr>
+              <w:rPr>
+                <w:sz w:val="18"/>
+                <w:szCs w:val="18"/>
+              </w:rPr>
+            </w:pPr>
             <w:r>
               <w:rPr>
                 <w:rFonts w:ascii="Arial" w:hAnsi="Arial" w:eastAsia="Arial" w:cs="Arial"/>
@@ -2028,6 +2235,12 @@
             </w:tcMar>
           </w:tcPr>
           <w:p>
+            <w:pPr>
+              <w:rPr>
+                <w:sz w:val="18"/>
+                <w:szCs w:val="18"/>
+              </w:rPr>
+            </w:pPr>
             <w:r>
               <w:rPr>
                 <w:rFonts w:hint="default" w:cs="Arial"/>
@@ -2083,6 +2296,12 @@
             </w:tcMar>
           </w:tcPr>
           <w:p>
+            <w:pPr>
+              <w:rPr>
+                <w:sz w:val="18"/>
+                <w:szCs w:val="18"/>
+              </w:rPr>
+            </w:pPr>
             <w:r>
               <w:rPr>
                 <w:rFonts w:ascii="Arial" w:hAnsi="Arial" w:eastAsia="Arial" w:cs="Arial"/>
@@ -2132,6 +2351,12 @@
             </w:tcMar>
           </w:tcPr>
           <w:p>
+            <w:pPr>
+              <w:rPr>
+                <w:sz w:val="18"/>
+                <w:szCs w:val="18"/>
+              </w:rPr>
+            </w:pPr>
             <w:r>
               <w:rPr>
                 <w:rFonts w:ascii="Arial" w:hAnsi="Arial" w:eastAsia="Arial" w:cs="Arial"/>
@@ -2163,6 +2388,12 @@
             </w:tcMar>
           </w:tcPr>
           <w:p>
+            <w:pPr>
+              <w:rPr>
+                <w:sz w:val="18"/>
+                <w:szCs w:val="18"/>
+              </w:rPr>
+            </w:pPr>
             <w:r>
               <w:rPr>
                 <w:rFonts w:ascii="Arial" w:hAnsi="Arial" w:eastAsia="Arial" w:cs="Arial"/>
@@ -2197,12 +2428,16 @@
             <w:pPr>
               <w:rPr>
                 <w:rFonts w:hint="default"/>
+                <w:sz w:val="18"/>
+                <w:szCs w:val="18"/>
                 <w:lang w:val="en-US"/>
               </w:rPr>
             </w:pPr>
             <w:r>
               <w:rPr>
                 <w:rFonts w:hint="default"/>
+                <w:sz w:val="18"/>
+                <w:szCs w:val="18"/>
                 <w:lang w:val="en-US"/>
               </w:rPr>
               <w:t>Niraj</w:t>
@@ -2227,6 +2462,12 @@
             </w:tcMar>
           </w:tcPr>
           <w:p>
+            <w:pPr>
+              <w:rPr>
+                <w:sz w:val="18"/>
+                <w:szCs w:val="18"/>
+              </w:rPr>
+            </w:pPr>
             <w:r>
               <w:rPr>
                 <w:rFonts w:ascii="Arial" w:hAnsi="Arial" w:eastAsia="Arial" w:cs="Arial"/>
@@ -2258,6 +2499,12 @@
             </w:tcMar>
           </w:tcPr>
           <w:p>
+            <w:pPr>
+              <w:rPr>
+                <w:sz w:val="18"/>
+                <w:szCs w:val="18"/>
+              </w:rPr>
+            </w:pPr>
             <w:r>
               <w:rPr>
                 <w:rFonts w:hint="default" w:cs="Arial"/>
@@ -2336,6 +2583,12 @@
             </w:tcMar>
           </w:tcPr>
           <w:p>
+            <w:pPr>
+              <w:rPr>
+                <w:sz w:val="18"/>
+                <w:szCs w:val="18"/>
+              </w:rPr>
+            </w:pPr>
             <w:r>
               <w:rPr>
                 <w:rFonts w:ascii="Arial" w:hAnsi="Arial" w:eastAsia="Arial" w:cs="Arial"/>
@@ -2350,6 +2603,7 @@
           </w:p>
         </w:tc>
       </w:tr>
+      <w:bookmarkEnd w:id="0"/>
     </w:tbl>
     <w:p>
       <w:pPr>
@@ -5774,8 +6028,6 @@
         </w:rPr>
         <w:t>.</w:t>
       </w:r>
-      <w:bookmarkStart w:id="0" w:name="_GoBack"/>
-      <w:bookmarkEnd w:id="0"/>
     </w:p>
     <w:p>
       <w:pPr>

</xml_diff>